<commit_message>
入殮師: 蠱耗感應 triggers on every death (no per-round pickup cap)
Each player's death now grants the embalmer +1 carry and one random
item from that corpse; docs and the v2 report updated to match.

Co-Authored-By: Claude Sonnet 5.5 <noreply@anthropic.com>
</commit_message>
<xml_diff>
--- a/禁閉逃殺_實體模式16職業評估報告_詳細版_v2.docx
+++ b/禁閉逃殺_實體模式16職業評估報告_詳細版_v2.docx
@@ -1924,7 +1924,7 @@
         <w:rPr>
           <w:b/>
         </w:rPr>
-        <w:t>強度 6.8 分（B 級）　新手友善 ★★☆☆☆　主持難度 ★★★★☆　模擬z +0.2</w:t>
+        <w:t>強度 7.3 分（B 級）　新手友善 ★★☆☆☆　主持難度 ★★★★☆　模擬z +0.2</w:t>
       </w:r>
     </w:p>
     <w:tbl>
@@ -2021,7 +2021,7 @@
               <w:rPr>
                 <w:sz w:val="19"/>
               </w:rPr>
-              <w:t>每當有玩家變成暗影，你的負重永久+1。道具放入停屍間前，你可隨機取走1張（每輪最多1張）。</w:t>
+              <w:t>每當有玩家變成暗影，你的負重永久+1。每位玩家死亡，其道具放入停屍間前，你都可隨機取走1張（不限每輪次數）；同一輪多人死亡，就從每位死者身上各取1張，負重也各+1。</w:t>
             </w:r>
           </w:p>
         </w:tc>
@@ -2082,7 +2082,7 @@
         <w:pStyle w:val="ListBullet"/>
       </w:pPr>
       <w:r>
-        <w:t>8~12人局死亡率高（水糧不足、毒氣、戰鬥），中後期每輪都有人死，負重永久+1累積得很快。</w:t>
+        <w:t>每位玩家死亡都各自觸發一次：負重永久+1，並從該名死者的背包隨機取走1張。一輪死3人＝負重+3、最多拿到3張（每位死者各1張），以此類推；沒有『每輪最多1張』的限制。</w:t>
       </w:r>
     </w:p>
     <w:p>
@@ -2090,7 +2090,7 @@
         <w:pStyle w:val="ListBullet"/>
       </w:pPr>
       <w:r>
-        <w:t>死者的道具先交給入殮師，他每輪隨機取走1張，不必走到停屍間B701；死者身上的槍械可直接拿到手。</w:t>
+        <w:t>死者在哪裡死都一樣，直接從其背包取得，不必走到停屍間B701；死者的道具除了被取走的1張，其餘才放入停屍間。</w:t>
       </w:r>
     </w:p>
     <w:p>
@@ -2098,7 +2098,7 @@
         <w:pStyle w:val="ListBullet"/>
       </w:pPr>
       <w:r>
-        <w:t>亡者遺贈只有1次，建議留給『看到死者有手槍／霰彈槍／藥片』的時候。</w:t>
+        <w:t>死者背包是空的就沒有道具可拿，但負重仍然+1。死者的槍械也可能被抽到。</w:t>
       </w:r>
     </w:p>
     <w:p>
@@ -2106,7 +2106,23 @@
         <w:pStyle w:val="ListBullet"/>
       </w:pPr>
       <w:r>
-        <w:t>前期沒有死亡時完全沒有作用。</w:t>
+        <w:t>取得的道具受負重限制；但負重也是同一次死亡先+1，所以通常裝得下。</w:t>
+      </w:r>
+    </w:p>
+    <w:p>
+      <w:pPr>
+        <w:pStyle w:val="ListBullet"/>
+      </w:pPr>
+      <w:r>
+        <w:t>亡者遺贈只有1次，可把該次死者的隨機取得改為自行指定1張，建議留給有霰彈槍、多張藥片或大量水糧的死者。</w:t>
+      </w:r>
+    </w:p>
+    <w:p>
+      <w:pPr>
+        <w:pStyle w:val="ListBullet"/>
+      </w:pPr>
+      <w:r>
+        <w:t>8~12人局中後期死亡集中（毒氣、飢餓、戰鬥），一輪死2~3人很常見；而前期（第1~2輪）幾乎沒有死亡，沒有作用。</w:t>
       </w:r>
     </w:p>
     <w:p>
@@ -2122,7 +2138,7 @@
         <w:pStyle w:val="ListBullet"/>
       </w:pPr>
       <w:r>
-        <w:t>死亡越多越強，是『慢熱』的最佳代表：負重成長＋免費領取死者道具。</w:t>
+        <w:t>死亡越多越強：一輪死3人就一次拿3張道具、負重+3，是整個陣容裡成長最快的職業。</w:t>
       </w:r>
     </w:p>
     <w:p>
@@ -2130,7 +2146,15 @@
         <w:pStyle w:val="ListBullet"/>
       </w:pPr>
       <w:r>
-        <w:t>不必移動就能取得死者的槍械，等於免費武器庫。</w:t>
+        <w:t>不必移動就能取得死者道具（含槍械），等於免費武器庫與補給站。</w:t>
+      </w:r>
+    </w:p>
+    <w:p>
+      <w:pPr>
+        <w:pStyle w:val="ListBullet"/>
+      </w:pPr>
+      <w:r>
+        <w:t>負重暴增後，可以帶滿水糧、藥片、武器，彌補前期的劣勢。</w:t>
       </w:r>
     </w:p>
     <w:p>
@@ -2146,7 +2170,7 @@
         <w:pStyle w:val="ListBullet"/>
       </w:pPr>
       <w:r>
-        <w:t>第1~2輪幾乎無作用；人少（5人以下）時特別弱。</w:t>
+        <w:t>前期（第1~2輪）幾乎沒有作用；人少（5人以下）或死亡少的局特別弱。</w:t>
       </w:r>
     </w:p>
     <w:p>
@@ -2154,7 +2178,7 @@
         <w:pStyle w:val="ListBullet"/>
       </w:pPr>
       <w:r>
-        <w:t>死者背包可能是空的；每輪最多只拿1張。</w:t>
+        <w:t>死者背包可能是空的；取得的是隨機1張，不一定有用。</w:t>
       </w:r>
     </w:p>
     <w:p>
@@ -2162,7 +2186,15 @@
         <w:pStyle w:val="ListBullet"/>
       </w:pPr>
       <w:r>
-        <w:t>自己仍要撐過毒氣與飢餓。</w:t>
+        <w:t>自己必須撐到中後期；若他自己先死，技能就沒有意義。</w:t>
+      </w:r>
+    </w:p>
+    <w:p>
+      <w:pPr>
+        <w:pStyle w:val="ListBullet"/>
+      </w:pPr>
+      <w:r>
+        <w:t>全局有人死亡才運作，主持人要處理多次死亡的結算。</w:t>
       </w:r>
     </w:p>
     <w:p>
@@ -2178,7 +2210,7 @@
         <w:pStyle w:val="ListBullet"/>
       </w:pPr>
       <w:r>
-        <w:t>配點建議：武力2／速度3／負重5（反正負重會越來越多）。</w:t>
+        <w:t>配點建議：武力2／速度4／負重4（後期負重會暴增，起手可少放負重，多放速度）。</w:t>
       </w:r>
     </w:p>
     <w:p>
@@ -2186,7 +2218,7 @@
         <w:pStyle w:val="ListBullet"/>
       </w:pPr>
       <w:r>
-        <w:t>第1~2輪：以生存為主，優先領水糧；避免任何衝突。</w:t>
+        <w:t>第1~2輪：以生存為主，優先領水糧；避免任何衝突；可靠近戰鬥多的房間（但不要捲入）。</w:t>
       </w:r>
     </w:p>
     <w:p>
@@ -2194,7 +2226,7 @@
         <w:pStyle w:val="ListBullet"/>
       </w:pPr>
       <w:r>
-        <w:t>第3~4輪：一旦出現暗影，開始每輪拿1張死者道具；優先選藥片或槍械。</w:t>
+        <w:t>第3~4輪：一旦開始有人死亡，每死一人就拿1張；優先留藥片、槍械、水糧；負重滿了就換掉較差的。</w:t>
       </w:r>
     </w:p>
     <w:p>
@@ -2202,7 +2234,7 @@
         <w:pStyle w:val="ListBullet"/>
       </w:pPr>
       <w:r>
-        <w:t>亡者遺贈：整局只有1次，建議用在第4輪以後看到死者有霰彈槍或2張以上藥片時。</w:t>
+        <w:t>亡者遺贈：整局只有1次，建議用在第4輪以後有死者持有霰彈槍或2張以上藥片時。</w:t>
       </w:r>
     </w:p>
     <w:p>
@@ -2210,7 +2242,15 @@
         <w:pStyle w:val="ListBullet"/>
       </w:pPr>
       <w:r>
-        <w:t>第5~6輪：負重高於其他人3~4點，可以帶滿水糧、藥片與槍械，與暗影使者錯開位置。</w:t>
+        <w:t>第5~6輪：負重高於其他人3~6點，可以帶很多武器與補給，也可成為強勢的後期收割者；仍要注意毒氣與火箭筒。</w:t>
+      </w:r>
+    </w:p>
+    <w:p>
+      <w:pPr>
+        <w:pStyle w:val="ListBullet"/>
+      </w:pPr>
+      <w:r>
+        <w:t>與暗影使者錯開位置，並避免與雇傭兵等持槍者同房。</w:t>
       </w:r>
     </w:p>
     <w:p>
@@ -2226,7 +2266,23 @@
         <w:pStyle w:val="ListBullet"/>
       </w:pPr>
       <w:r>
-        <w:t>維持現狀；5人以下的局不建議開入殮師。</w:t>
+        <w:t>取消『每輪最多1張』後，入殮師在多人死亡的局中成長非常快，我把強度由6.8提高到7.3（B級上段）。</w:t>
+      </w:r>
+    </w:p>
+    <w:p>
+      <w:pPr>
+        <w:pStyle w:val="ListBullet"/>
+      </w:pPr>
+      <w:r>
+        <w:t>若實測偏強，可改為：①每輪最多取2張；②或只能從『死亡當輪』的死者取，且槍械不可取；③或負重加成改為每輪最多+2。</w:t>
+      </w:r>
+    </w:p>
+    <w:p>
+      <w:pPr>
+        <w:pStyle w:val="ListBullet"/>
+      </w:pPr>
+      <w:r>
+        <w:t>5人以下的局仍不建議使用。</w:t>
       </w:r>
     </w:p>
     <w:p>
@@ -2237,7 +2293,7 @@
         <w:t>主持人提醒：</w:t>
       </w:r>
       <w:r>
-        <w:t>死者的道具先交給主持人，入殮師當場抽1張，其餘放入停屍間牌堆。</w:t>
+        <w:t>死者的道具先交給主持人，入殮師每位死者當場抽1張，其餘放入停屍間牌堆；多人死亡時逐一處理。</w:t>
       </w:r>
     </w:p>
     <w:p>
@@ -6099,7 +6155,7 @@
               <w:rPr>
                 <w:sz w:val="19"/>
               </w:rPr>
-              <w:t>6.8</w:t>
+              <w:t>7.3</w:t>
             </w:r>
           </w:p>
         </w:tc>
@@ -7432,7 +7488,7 @@
     <w:p/>
     <w:p>
       <w:r>
-        <w:t>16 位平均 6.40 分。與上一版相比：雇傭兵 9.1→8.0（取消『刀視為槍』後，強度取決於是否搶到全場僅6把的槍）；飲品師 7.0→8.3（酒量、剔除機制，加上舉杯共飲可替盟友穩定增益、對敵人1/2機率丟光全部道具）；私家偵探 6.8→6.5（只能跟蹤行動順序靠前的玩家）；拾荒者 6.1→6.0；其餘維持。</w:t>
+        <w:t>16 位平均 6.43 分。與上一版相比：雇傭兵 9.1→8.0（取消『刀視為槍』後，強度取決於是否搶到全場僅6把的槍）；飲品師 7.0→8.3（酒量、剔除機制，加上舉杯共飲可替盟友穩定增益、對敵人1/2機率丟光全部道具）；私家偵探 6.8→6.5（只能跟蹤行動順序靠前的玩家）；入殮師 6.8→7.3（蠱耗感應取消每輪1張上限）；拾荒者 6.1→6.0；其餘維持。</w:t>
       </w:r>
     </w:p>
     <w:p>
@@ -7564,7 +7620,7 @@
               <w:rPr>
                 <w:sz w:val="19"/>
               </w:rPr>
-              <w:t>馴獸師（7.4）、入殮師（6.8）、庸才（6.7）、富豪（6.6）、私家偵探（6.5）、暗影使者（6.5）、基因怪人（6.4）、攀岩者（6.2）、拾荒者（6.0）、屠夫（6.0）</w:t>
+              <w:t>馴獸師（7.4）、入殮師（7.3）、庸才（6.7）、富豪（6.6）、私家偵探（6.5）、暗影使者（6.5）、基因怪人（6.4）、攀岩者（6.2）、拾荒者（6.0）、屠夫（6.0）</w:t>
             </w:r>
           </w:p>
         </w:tc>
@@ -7687,7 +7743,7 @@
         <w:t xml:space="preserve">後期型：入殮師 vs 暗影使者　</w:t>
       </w:r>
       <w:r>
-        <w:t>入殮師（6.8）與暗影使者（6.5）都靠死亡運作：入殮師穩定獲得道具與負重，暗影使者靠暗影吸血回血；兩者前期都弱，5人以下局不建議使用。</w:t>
+        <w:t>入殮師（7.3）與暗影使者（6.5）都靠死亡運作：入殮師穩定獲得道具與負重，暗影使者靠暗影吸血回血；兩者前期都弱，5人以下局不建議使用。</w:t>
       </w:r>
     </w:p>
     <w:p>

</xml_diff>

<commit_message>
Fix report cross-reference and weakest-roles ordering
Co-Authored-By: Claude Sonnet 5.5 <noreply@anthropic.com>
</commit_message>
<xml_diff>
--- a/禁閉逃殺_實體模式16職業評估報告_詳細版_v2.docx
+++ b/禁閉逃殺_實體模式16職業評估報告_詳細版_v2.docx
@@ -7689,7 +7689,7 @@
     <w:p/>
     <w:p>
       <w:r>
-        <w:t>16 位平均 6.47 分。強度＝理論評估與 AI 模擬折算的加權結果（可模擬的職業以模擬為主、AI 玩不好的職業以理論為主，見 2-0）。與修正前（理論分）的差異：雇傭兵 8.0→6.8；購物大媽 5.1→6.1；屠夫 6.0→6.9；工程師 5.0→5.8；飲品師 8.3→7.6；吸血鬼 5.6→6.2；還魂師 6.4→7.0；入殮師 7.3→6.8。</w:t>
+        <w:t>16 位平均 6.47 分。強度＝理論評估與 AI 模擬折算的加權結果（可模擬的職業以模擬為主、AI 玩不好的職業以理論為主，見 2-5）。與修正前（理論分）的差異：雇傭兵 8.0→6.8；購物大媽 5.1→6.1；屠夫 6.0→6.9；工程師 5.0→5.8；飲品師 8.3→7.6；吸血鬼 5.6→6.2；還魂師 6.4→7.0；入殮師 7.3→6.8。</w:t>
       </w:r>
     </w:p>
     <w:p>
@@ -7968,7 +7968,7 @@
         <w:pStyle w:val="ListBullet"/>
       </w:pPr>
       <w:r>
-        <w:t>最弱的是橡膠人（5.7）與幸運兒（5.6）、工程師（5.8）；橡膠人的『無法持槍』使其幾乎沒有輸出，建議放寬。</w:t>
+        <w:t>最弱的是幸運兒（5.6）、橡膠人（5.7）、工程師（5.8）；橡膠人的『無法持槍』使其幾乎沒有輸出，建議放寬。</w:t>
       </w:r>
     </w:p>
     <w:p>

</xml_diff>